<commit_message>
Databasemanagement fase 2: interactieve leesversie + NoSQL-elective + Toolbijlage B
Interactieve leesversie (reader/werkboek/docentenhandleiding/slidedeck als
HTML, tabs + prev/next-navigatie + downloadkader) voor alle 30 delen, met
26 nieuw getekende figuren in Ductus-huisstijl (SVG, gerasterized naar PNG)
ingebed in zowel de HTML als de bijbehorende .docx/.pptx-downloads.

NoSQL-elective (2 delen, buiten de dertig-delen-nummering, geen aparte
certificeringslijn): werkt de vier scenario's uit deel 21 daadwerkelijk uit
in Redis, MongoDB, Cassandra en Neo4j.

Toolbijlage B: klikpaden voor pgAdmin en psql (kernhandelingen), als
vervolg op Toolbijlage A.

courses.json: downloadblok-notitie verwijderd nu de interactieve versie
live is. Build-tooling in databasemanagement-build/ (analoog aan
risico-build), bronscripts (figuur-generator, docx/pptx-converters) in
c:\Projecten\eductus-trainingen\Databasemanagement\scripts.
</commit_message>
<xml_diff>
--- a/databasemanagement/niveau-1/deel-01-databases-en-het-dbms-landschap-waarom-postgresql/reader.docx
+++ b/databasemanagement/niveau-1/deel-01-databases-en-het-dbms-landschap-waarom-postgresql/reader.docx
@@ -1139,13 +1139,65 @@
       </w:pPr>
     </w:p>
     <w:p>
-      <w:r>
-        <w:rPr>
+      <w:pPr>
+        <w:spacing w:after="80" w:before="200"/>
+        <w:jc w:val="center"/>
+      </w:pPr>
+      <w:r>
+        <w:drawing>
+          <wp:inline distT="0" distB="0" distL="0" distR="0">
+            <wp:extent cx="5715000" cy="3333750"/>
+            <wp:effectExtent t="0" r="0" b="0" l="0"/>
+            <wp:docPr id="1" name="figuur-1-1" descr="FIGUUR 1-1: Contextplaat Meridiaan — kernadministratie, exportschil, en de beoogde nieuwe datalaag" title="Figuur 1-1"/>
+            <wp:cNvGraphicFramePr>
+              <a:graphicFrameLocks xmlns:a="http://schemas.openxmlformats.org/drawingml/2006/main" noChangeAspect="1"/>
+            </wp:cNvGraphicFramePr>
+            <a:graphic xmlns:a="http://schemas.openxmlformats.org/drawingml/2006/main">
+              <a:graphicData uri="http://schemas.openxmlformats.org/drawingml/2006/picture">
+                <pic:pic xmlns:pic="http://schemas.openxmlformats.org/drawingml/2006/picture">
+                  <pic:nvPicPr>
+                    <pic:cNvPr id="0" name="" descr=""/>
+                    <pic:cNvPicPr>
+                      <a:picLocks noChangeAspect="1" noChangeArrowheads="1"/>
+                    </pic:cNvPicPr>
+                  </pic:nvPicPr>
+                  <pic:blipFill>
+                    <a:blip r:embed="rId9" cstate="none"/>
+                    <a:srcRect/>
+                    <a:stretch>
+                      <a:fillRect/>
+                    </a:stretch>
+                  </pic:blipFill>
+                  <pic:spPr bwMode="auto">
+                    <a:xfrm>
+                      <a:off x="0" y="0"/>
+                      <a:ext cx="5715000" cy="3333750"/>
+                    </a:xfrm>
+                    <a:prstGeom prst="rect">
+                      <a:avLst/>
+                    </a:prstGeom>
+                  </pic:spPr>
+                </pic:pic>
+              </a:graphicData>
+            </a:graphic>
+          </wp:inline>
+        </w:drawing>
+      </w:r>
+    </w:p>
+    <w:p>
+      <w:pPr>
+        <w:jc w:val="center"/>
+      </w:pPr>
+      <w:r>
+        <w:rPr>
+          <w:rFonts w:ascii="DM Sans" w:cs="DM Sans" w:eastAsia="DM Sans" w:hAnsi="DM Sans"/>
           <w:i/>
           <w:iCs/>
-          <w:color w:val="FF0000"/>
-        </w:rPr>
-        <w:t xml:space="preserve">[Ontbrekende figuur: FIGUUR 1-1: Contextplaat Meridiaan — kernadministratie, exportschil, en de beoogde nieuwe datalaag]</w:t>
+          <w:color w:val="55606F"/>
+          <w:sz w:val="18"/>
+          <w:szCs w:val="18"/>
+        </w:rPr>
+        <w:t xml:space="preserve">Figuur 1-1</w:t>
       </w:r>
     </w:p>
     <w:p>
@@ -1349,13 +1401,65 @@
       </w:r>
     </w:p>
     <w:p>
-      <w:r>
-        <w:rPr>
+      <w:pPr>
+        <w:spacing w:after="80" w:before="200"/>
+        <w:jc w:val="center"/>
+      </w:pPr>
+      <w:r>
+        <w:drawing>
+          <wp:inline distT="0" distB="0" distL="0" distR="0">
+            <wp:extent cx="5715000" cy="3333750"/>
+            <wp:effectExtent t="0" r="0" b="0" l="0"/>
+            <wp:docPr id="1" name="figuur-1-2" descr="FIGUUR 1-2: De zes problemen van bestandsopslag, gekoppeld aan de cursusdelen waar de oplossing behandeld wordt" title="Figuur 1-2"/>
+            <wp:cNvGraphicFramePr>
+              <a:graphicFrameLocks xmlns:a="http://schemas.openxmlformats.org/drawingml/2006/main" noChangeAspect="1"/>
+            </wp:cNvGraphicFramePr>
+            <a:graphic xmlns:a="http://schemas.openxmlformats.org/drawingml/2006/main">
+              <a:graphicData uri="http://schemas.openxmlformats.org/drawingml/2006/picture">
+                <pic:pic xmlns:pic="http://schemas.openxmlformats.org/drawingml/2006/picture">
+                  <pic:nvPicPr>
+                    <pic:cNvPr id="0" name="" descr=""/>
+                    <pic:cNvPicPr>
+                      <a:picLocks noChangeAspect="1" noChangeArrowheads="1"/>
+                    </pic:cNvPicPr>
+                  </pic:nvPicPr>
+                  <pic:blipFill>
+                    <a:blip r:embed="rId10" cstate="none"/>
+                    <a:srcRect/>
+                    <a:stretch>
+                      <a:fillRect/>
+                    </a:stretch>
+                  </pic:blipFill>
+                  <pic:spPr bwMode="auto">
+                    <a:xfrm>
+                      <a:off x="0" y="0"/>
+                      <a:ext cx="5715000" cy="3333750"/>
+                    </a:xfrm>
+                    <a:prstGeom prst="rect">
+                      <a:avLst/>
+                    </a:prstGeom>
+                  </pic:spPr>
+                </pic:pic>
+              </a:graphicData>
+            </a:graphic>
+          </wp:inline>
+        </w:drawing>
+      </w:r>
+    </w:p>
+    <w:p>
+      <w:pPr>
+        <w:jc w:val="center"/>
+      </w:pPr>
+      <w:r>
+        <w:rPr>
+          <w:rFonts w:ascii="DM Sans" w:cs="DM Sans" w:eastAsia="DM Sans" w:hAnsi="DM Sans"/>
           <w:i/>
           <w:iCs/>
-          <w:color w:val="FF0000"/>
-        </w:rPr>
-        <w:t xml:space="preserve">[Ontbrekende figuur: FIGUUR 1-2: De zes problemen van bestandsopslag, gekoppeld aan de cursusdelen waar de oplossing behandeld wordt]</w:t>
+          <w:color w:val="55606F"/>
+          <w:sz w:val="18"/>
+          <w:szCs w:val="18"/>
+        </w:rPr>
+        <w:t xml:space="preserve">Figuur 1-2</w:t>
       </w:r>
     </w:p>
     <w:p>
@@ -2028,13 +2132,65 @@
       </w:r>
     </w:p>
     <w:p>
-      <w:r>
-        <w:rPr>
+      <w:pPr>
+        <w:spacing w:after="80" w:before="200"/>
+        <w:jc w:val="center"/>
+      </w:pPr>
+      <w:r>
+        <w:drawing>
+          <wp:inline distT="0" distB="0" distL="0" distR="0">
+            <wp:extent cx="5715000" cy="3333750"/>
+            <wp:effectExtent t="0" r="0" b="0" l="0"/>
+            <wp:docPr id="1" name="figuur-1-3" descr="FIGUUR 1-3: Landschapskaart datastores, geplaatst op de assen &quot;schemastrengheid&quot; en &quot;schaalmodel&quot;" title="Figuur 1-3"/>
+            <wp:cNvGraphicFramePr>
+              <a:graphicFrameLocks xmlns:a="http://schemas.openxmlformats.org/drawingml/2006/main" noChangeAspect="1"/>
+            </wp:cNvGraphicFramePr>
+            <a:graphic xmlns:a="http://schemas.openxmlformats.org/drawingml/2006/main">
+              <a:graphicData uri="http://schemas.openxmlformats.org/drawingml/2006/picture">
+                <pic:pic xmlns:pic="http://schemas.openxmlformats.org/drawingml/2006/picture">
+                  <pic:nvPicPr>
+                    <pic:cNvPr id="0" name="" descr=""/>
+                    <pic:cNvPicPr>
+                      <a:picLocks noChangeAspect="1" noChangeArrowheads="1"/>
+                    </pic:cNvPicPr>
+                  </pic:nvPicPr>
+                  <pic:blipFill>
+                    <a:blip r:embed="rId11" cstate="none"/>
+                    <a:srcRect/>
+                    <a:stretch>
+                      <a:fillRect/>
+                    </a:stretch>
+                  </pic:blipFill>
+                  <pic:spPr bwMode="auto">
+                    <a:xfrm>
+                      <a:off x="0" y="0"/>
+                      <a:ext cx="5715000" cy="3333750"/>
+                    </a:xfrm>
+                    <a:prstGeom prst="rect">
+                      <a:avLst/>
+                    </a:prstGeom>
+                  </pic:spPr>
+                </pic:pic>
+              </a:graphicData>
+            </a:graphic>
+          </wp:inline>
+        </w:drawing>
+      </w:r>
+    </w:p>
+    <w:p>
+      <w:pPr>
+        <w:jc w:val="center"/>
+      </w:pPr>
+      <w:r>
+        <w:rPr>
+          <w:rFonts w:ascii="DM Sans" w:cs="DM Sans" w:eastAsia="DM Sans" w:hAnsi="DM Sans"/>
           <w:i/>
           <w:iCs/>
-          <w:color w:val="FF0000"/>
-        </w:rPr>
-        <w:t xml:space="preserve">[Ontbrekende figuur: FIGUUR 1-3: Landschapskaart datastores, geplaatst op de assen "schemastrengheid" en "schaalmodel"]</w:t>
+          <w:color w:val="55606F"/>
+          <w:sz w:val="18"/>
+          <w:szCs w:val="18"/>
+        </w:rPr>
+        <w:t xml:space="preserve">Figuur 1-3</w:t>
       </w:r>
     </w:p>
     <w:p>
@@ -4251,13 +4407,65 @@
       </w:r>
     </w:p>
     <w:p>
-      <w:r>
-        <w:rPr>
+      <w:pPr>
+        <w:spacing w:after="80" w:before="200"/>
+        <w:jc w:val="center"/>
+      </w:pPr>
+      <w:r>
+        <w:drawing>
+          <wp:inline distT="0" distB="0" distL="0" distR="0">
+            <wp:extent cx="5715000" cy="3333750"/>
+            <wp:effectExtent t="0" r="0" b="0" l="0"/>
+            <wp:docPr id="1" name="figuur-1-4" descr="FIGUUR 1-4: Beslisboom &quot;is PostgreSQL hier passend?&quot;" title="Figuur 1-4"/>
+            <wp:cNvGraphicFramePr>
+              <a:graphicFrameLocks xmlns:a="http://schemas.openxmlformats.org/drawingml/2006/main" noChangeAspect="1"/>
+            </wp:cNvGraphicFramePr>
+            <a:graphic xmlns:a="http://schemas.openxmlformats.org/drawingml/2006/main">
+              <a:graphicData uri="http://schemas.openxmlformats.org/drawingml/2006/picture">
+                <pic:pic xmlns:pic="http://schemas.openxmlformats.org/drawingml/2006/picture">
+                  <pic:nvPicPr>
+                    <pic:cNvPr id="0" name="" descr=""/>
+                    <pic:cNvPicPr>
+                      <a:picLocks noChangeAspect="1" noChangeArrowheads="1"/>
+                    </pic:cNvPicPr>
+                  </pic:nvPicPr>
+                  <pic:blipFill>
+                    <a:blip r:embed="rId12" cstate="none"/>
+                    <a:srcRect/>
+                    <a:stretch>
+                      <a:fillRect/>
+                    </a:stretch>
+                  </pic:blipFill>
+                  <pic:spPr bwMode="auto">
+                    <a:xfrm>
+                      <a:off x="0" y="0"/>
+                      <a:ext cx="5715000" cy="3333750"/>
+                    </a:xfrm>
+                    <a:prstGeom prst="rect">
+                      <a:avLst/>
+                    </a:prstGeom>
+                  </pic:spPr>
+                </pic:pic>
+              </a:graphicData>
+            </a:graphic>
+          </wp:inline>
+        </w:drawing>
+      </w:r>
+    </w:p>
+    <w:p>
+      <w:pPr>
+        <w:jc w:val="center"/>
+      </w:pPr>
+      <w:r>
+        <w:rPr>
+          <w:rFonts w:ascii="DM Sans" w:cs="DM Sans" w:eastAsia="DM Sans" w:hAnsi="DM Sans"/>
           <w:i/>
           <w:iCs/>
-          <w:color w:val="FF0000"/>
-        </w:rPr>
-        <w:t xml:space="preserve">[Ontbrekende figuur: FIGUUR 1-4: Beslisboom "is PostgreSQL hier passend?"]</w:t>
+          <w:color w:val="55606F"/>
+          <w:sz w:val="18"/>
+          <w:szCs w:val="18"/>
+        </w:rPr>
+        <w:t xml:space="preserve">Figuur 1-4</w:t>
       </w:r>
     </w:p>
     <w:p>

</xml_diff>